<commit_message>
Update Simulacion de Algoritmos Bioinspirados en Netlogo.docx
</commit_message>
<xml_diff>
--- a/Simulacion de Algoritmos Bioinspirados en Netlogo.docx
+++ b/Simulacion de Algoritmos Bioinspirados en Netlogo.docx
@@ -30787,17 +30787,6 @@
       <w:pPr>
         <w:spacing w:line="360" w:lineRule="auto"/>
         <w:rPr>
-          <w:b/>
-          <w:szCs w:val="24"/>
-          <w:lang w:val="es-ES"/>
-        </w:rPr>
-      </w:pPr>
-    </w:p>
-    <w:p>
-      <w:pPr>
-        <w:spacing w:line="360" w:lineRule="auto"/>
-        <w:rPr>
-          <w:b/>
           <w:szCs w:val="24"/>
           <w:lang w:val="es-ES"/>
         </w:rPr>
@@ -30813,6 +30802,35 @@
       </w:pPr>
       <w:bookmarkStart w:id="0" w:name="_GoBack"/>
       <w:bookmarkEnd w:id="0"/>
+    </w:p>
+    <w:p>
+      <w:pPr>
+        <w:spacing w:line="360" w:lineRule="auto"/>
+        <w:rPr>
+          <w:b/>
+          <w:szCs w:val="24"/>
+          <w:lang w:val="es-ES"/>
+        </w:rPr>
+      </w:pPr>
+    </w:p>
+    <w:p>
+      <w:pPr>
+        <w:spacing w:line="360" w:lineRule="auto"/>
+        <w:rPr>
+          <w:b/>
+          <w:szCs w:val="24"/>
+          <w:lang w:val="es-ES"/>
+        </w:rPr>
+      </w:pPr>
+    </w:p>
+    <w:p>
+      <w:pPr>
+        <w:spacing w:line="360" w:lineRule="auto"/>
+        <w:rPr>
+          <w:szCs w:val="24"/>
+          <w:lang w:val="es-ES"/>
+        </w:rPr>
+      </w:pPr>
     </w:p>
     <w:sectPr>
       <w:pgSz w:w="11906" w:h="16840"/>
@@ -32707,7 +32725,7 @@
 </file>
 
 <file path=customXml/itemProps1.xml><?xml version="1.0" encoding="utf-8"?>
-<ds:datastoreItem xmlns:ds="http://schemas.openxmlformats.org/officeDocument/2006/customXml" ds:itemID="{1E2DB116-F437-4E66-9A07-62F8267FEE9F}">
+<ds:datastoreItem xmlns:ds="http://schemas.openxmlformats.org/officeDocument/2006/customXml" ds:itemID="{137437B6-41DA-4238-B680-7FD9393EA98C}">
   <ds:schemaRefs>
     <ds:schemaRef ds:uri="http://schemas.openxmlformats.org/officeDocument/2006/bibliography"/>
   </ds:schemaRefs>

</xml_diff>